<commit_message>
Updated login for dashboard improvements
</commit_message>
<xml_diff>
--- a/docs/Folder structure.docx
+++ b/docs/Folder structure.docx
@@ -872,120 +872,93 @@
         </w:rPr>
         <w:t xml:space="preserve">│   ├── GradeView.java         </w:t>
       </w:r>
+    </w:p>
+    <w:p>
+      <w:pPr>
+        <w:rPr>
+          <w:rFonts w:hint="default"/>
+        </w:rPr>
+      </w:pPr>
+      <w:r>
+        <w:rPr>
+          <w:rFonts w:hint="default"/>
+        </w:rPr>
+        <w:t>│   ├── GradeController.java</w:t>
+      </w:r>
+    </w:p>
+    <w:p>
+      <w:pPr>
+        <w:rPr>
+          <w:rFonts w:hint="default"/>
+        </w:rPr>
+      </w:pPr>
+      <w:r>
+        <w:rPr>
+          <w:rFonts w:hint="default"/>
+        </w:rPr>
+        <w:t>│   ├── GradeService.java</w:t>
+      </w:r>
+    </w:p>
+    <w:p>
+      <w:pPr>
+        <w:rPr>
+          <w:rFonts w:hint="default"/>
+        </w:rPr>
+      </w:pPr>
+      <w:r>
+        <w:rPr>
+          <w:rFonts w:hint="default"/>
+        </w:rPr>
+        <w:t>│   └── GradeRepository.java</w:t>
+      </w:r>
+    </w:p>
+    <w:p>
+      <w:pPr>
+        <w:rPr>
+          <w:rFonts w:hint="default"/>
+        </w:rPr>
+      </w:pPr>
+      <w:r>
+        <w:rPr>
+          <w:rFonts w:hint="default"/>
+        </w:rPr>
+        <w:t>│</w:t>
+      </w:r>
+    </w:p>
+    <w:p>
+      <w:pPr>
+        <w:rPr>
+          <w:rFonts w:hint="default"/>
+        </w:rPr>
+      </w:pPr>
+      <w:r>
+        <w:rPr>
+          <w:rFonts w:hint="default"/>
+        </w:rPr>
+        <w:t>common/</w:t>
+      </w:r>
+    </w:p>
+    <w:p>
+      <w:pPr>
+        <w:rPr>
+          <w:rFonts w:hint="default"/>
+        </w:rPr>
+      </w:pPr>
+      <w:r>
+        <w:rPr>
+          <w:rFonts w:hint="default"/>
+        </w:rPr>
+        <w:t>├── DatabaseConnection.java</w:t>
+      </w:r>
+    </w:p>
+    <w:p>
+      <w:pPr>
+        <w:rPr>
+          <w:rFonts w:hint="default"/>
+        </w:rPr>
+      </w:pPr>
       <w:bookmarkStart w:id="0" w:name="_GoBack"/>
       <w:bookmarkEnd w:id="0"/>
-    </w:p>
-    <w:p>
-      <w:pPr>
-        <w:rPr>
-          <w:rFonts w:hint="default"/>
-        </w:rPr>
-      </w:pPr>
-      <w:r>
-        <w:rPr>
-          <w:rFonts w:hint="default"/>
-        </w:rPr>
-        <w:t>│   ├── GradeController.java</w:t>
-      </w:r>
-    </w:p>
-    <w:p>
-      <w:pPr>
-        <w:rPr>
-          <w:rFonts w:hint="default"/>
-        </w:rPr>
-      </w:pPr>
-      <w:r>
-        <w:rPr>
-          <w:rFonts w:hint="default"/>
-        </w:rPr>
-        <w:t>│   ├── GradeService.java</w:t>
-      </w:r>
-    </w:p>
-    <w:p>
-      <w:pPr>
-        <w:rPr>
-          <w:rFonts w:hint="default"/>
-        </w:rPr>
-      </w:pPr>
-      <w:r>
-        <w:rPr>
-          <w:rFonts w:hint="default"/>
-        </w:rPr>
-        <w:t>│   └── GradeRepository.java</w:t>
-      </w:r>
-    </w:p>
-    <w:p>
-      <w:pPr>
-        <w:rPr>
-          <w:rFonts w:hint="default"/>
-        </w:rPr>
-      </w:pPr>
-      <w:r>
-        <w:rPr>
-          <w:rFonts w:hint="default"/>
-        </w:rPr>
-        <w:t>│</w:t>
-      </w:r>
-    </w:p>
-    <w:p>
-      <w:pPr>
-        <w:rPr>
-          <w:rFonts w:hint="default"/>
-        </w:rPr>
-      </w:pPr>
-      <w:r>
-        <w:rPr>
-          <w:rFonts w:hint="default"/>
-        </w:rPr>
-        <w:t>└── common/</w:t>
-      </w:r>
-    </w:p>
-    <w:p>
-      <w:pPr>
-        <w:rPr>
-          <w:rFonts w:hint="default"/>
-        </w:rPr>
-      </w:pPr>
-      <w:r>
-        <w:rPr>
-          <w:rFonts w:hint="default"/>
-        </w:rPr>
-        <w:t xml:space="preserve">    ├── DatabaseConnection.java</w:t>
-      </w:r>
-    </w:p>
-    <w:p>
-      <w:pPr>
-        <w:rPr>
-          <w:rFonts w:hint="default"/>
-        </w:rPr>
-      </w:pPr>
-      <w:r>
-        <w:rPr>
-          <w:rFonts w:hint="default"/>
-        </w:rPr>
-        <w:t xml:space="preserve">    ├── Validation.java</w:t>
-      </w:r>
-    </w:p>
-    <w:p>
-      <w:pPr>
-        <w:rPr>
-          <w:rFonts w:hint="default"/>
-        </w:rPr>
-      </w:pPr>
-      <w:r>
-        <w:rPr>
-          <w:rFonts w:hint="default"/>
-        </w:rPr>
-        <w:t xml:space="preserve">    ├── AlertUtil.java</w:t>
-      </w:r>
-    </w:p>
-    <w:p>
-      <w:r>
-        <w:rPr>
-          <w:rFonts w:hint="default"/>
-        </w:rPr>
-        <w:t xml:space="preserve">    └── IDGenerator.java</w:t>
-      </w:r>
     </w:p>
     <w:sectPr>
       <w:pgSz w:w="11906" w:h="16838"/>

</xml_diff>